<commit_message>
hoan thanh hoan thien cau 1**
</commit_message>
<xml_diff>
--- a/may11WORD.txt.docx
+++ b/may11WORD.txt.docx
@@ -26,32 +26,82 @@
           <w:sz w:val="26"/>
           <w:szCs w:val="26"/>
         </w:rPr>
-        <w:t xml:space="preserve"> 1: Công </w:t>
-      </w:r>
-      <w:proofErr w:type="spellStart"/>
-      <w:r>
-        <w:rPr>
-          <w:rFonts w:ascii="Times New Roman" w:hAnsi="Times New Roman" w:cs="Times New Roman"/>
-          <w:sz w:val="26"/>
-          <w:szCs w:val="26"/>
-        </w:rPr>
-        <w:t>dụng</w:t>
-      </w:r>
-      <w:proofErr w:type="spellEnd"/>
-      <w:r>
-        <w:rPr>
-          <w:rFonts w:ascii="Times New Roman" w:hAnsi="Times New Roman" w:cs="Times New Roman"/>
-          <w:sz w:val="26"/>
-          <w:szCs w:val="26"/>
-        </w:rPr>
-        <w:t xml:space="preserve"> </w:t>
-      </w:r>
-      <w:proofErr w:type="spellStart"/>
-      <w:r>
-        <w:rPr>
-          <w:rFonts w:ascii="Times New Roman" w:hAnsi="Times New Roman" w:cs="Times New Roman"/>
-          <w:sz w:val="26"/>
-          <w:szCs w:val="26"/>
+        <w:t xml:space="preserve"> 1: </w:t>
+      </w:r>
+      <w:proofErr w:type="spellStart"/>
+      <w:r>
+        <w:rPr>
+          <w:rFonts w:ascii="Times New Roman" w:hAnsi="Times New Roman" w:cs="Times New Roman"/>
+          <w:kern w:val="0"/>
+          <w:sz w:val="26"/>
+          <w:szCs w:val="26"/>
+          <w14:ligatures w14:val="none"/>
+        </w:rPr>
+        <w:t>Chức</w:t>
+      </w:r>
+      <w:proofErr w:type="spellEnd"/>
+      <w:r>
+        <w:rPr>
+          <w:rFonts w:ascii="Times New Roman" w:hAnsi="Times New Roman" w:cs="Times New Roman"/>
+          <w:kern w:val="0"/>
+          <w:sz w:val="26"/>
+          <w:szCs w:val="26"/>
+          <w14:ligatures w14:val="none"/>
+        </w:rPr>
+        <w:t xml:space="preserve"> </w:t>
+      </w:r>
+      <w:proofErr w:type="spellStart"/>
+      <w:r>
+        <w:rPr>
+          <w:rFonts w:ascii="Times New Roman" w:hAnsi="Times New Roman" w:cs="Times New Roman"/>
+          <w:kern w:val="0"/>
+          <w:sz w:val="26"/>
+          <w:szCs w:val="26"/>
+          <w14:ligatures w14:val="none"/>
+        </w:rPr>
+        <w:t>năng</w:t>
+      </w:r>
+      <w:proofErr w:type="spellEnd"/>
+      <w:r>
+        <w:rPr>
+          <w:rFonts w:ascii="Times New Roman" w:hAnsi="Times New Roman" w:cs="Times New Roman"/>
+          <w:kern w:val="0"/>
+          <w:sz w:val="26"/>
+          <w:szCs w:val="26"/>
+          <w14:ligatures w14:val="none"/>
+        </w:rPr>
+        <w:t xml:space="preserve"> </w:t>
+      </w:r>
+      <w:proofErr w:type="spellStart"/>
+      <w:r>
+        <w:rPr>
+          <w:rFonts w:ascii="Times New Roman" w:hAnsi="Times New Roman" w:cs="Times New Roman"/>
+          <w:kern w:val="0"/>
+          <w:sz w:val="26"/>
+          <w:szCs w:val="26"/>
+          <w14:ligatures w14:val="none"/>
+        </w:rPr>
+        <w:t>chính</w:t>
+      </w:r>
+      <w:proofErr w:type="spellEnd"/>
+      <w:r>
+        <w:rPr>
+          <w:rFonts w:ascii="Times New Roman" w:hAnsi="Times New Roman" w:cs="Times New Roman"/>
+          <w:kern w:val="0"/>
+          <w:sz w:val="26"/>
+          <w:szCs w:val="26"/>
+          <w14:ligatures w14:val="none"/>
+        </w:rPr>
+        <w:t xml:space="preserve"> </w:t>
+      </w:r>
+      <w:proofErr w:type="spellStart"/>
+      <w:r>
+        <w:rPr>
+          <w:rFonts w:ascii="Times New Roman" w:hAnsi="Times New Roman" w:cs="Times New Roman"/>
+          <w:kern w:val="0"/>
+          <w:sz w:val="26"/>
+          <w:szCs w:val="26"/>
+          <w14:ligatures w14:val="none"/>
         </w:rPr>
         <w:t>của</w:t>
       </w:r>
@@ -59,353 +109,1190 @@
       <w:r>
         <w:rPr>
           <w:rFonts w:ascii="Times New Roman" w:hAnsi="Times New Roman" w:cs="Times New Roman"/>
-          <w:sz w:val="26"/>
-          <w:szCs w:val="26"/>
-        </w:rPr>
-        <w:t xml:space="preserve"> </w:t>
-      </w:r>
-      <w:proofErr w:type="spellStart"/>
-      <w:r>
-        <w:rPr>
-          <w:rFonts w:ascii="Times New Roman" w:hAnsi="Times New Roman" w:cs="Times New Roman"/>
-          <w:sz w:val="26"/>
-          <w:szCs w:val="26"/>
+          <w:kern w:val="0"/>
+          <w:sz w:val="26"/>
+          <w:szCs w:val="26"/>
+          <w14:ligatures w14:val="none"/>
+        </w:rPr>
+        <w:t xml:space="preserve"> </w:t>
+      </w:r>
+      <w:proofErr w:type="spellStart"/>
+      <w:r>
+        <w:rPr>
+          <w:rFonts w:ascii="Times New Roman" w:hAnsi="Times New Roman" w:cs="Times New Roman"/>
+          <w:kern w:val="0"/>
+          <w:sz w:val="26"/>
+          <w:szCs w:val="26"/>
+          <w14:ligatures w14:val="none"/>
+        </w:rPr>
+        <w:t>nó</w:t>
+      </w:r>
+      <w:proofErr w:type="spellEnd"/>
+      <w:r>
+        <w:rPr>
+          <w:rFonts w:ascii="Times New Roman" w:hAnsi="Times New Roman" w:cs="Times New Roman"/>
+          <w:kern w:val="0"/>
+          <w:sz w:val="26"/>
+          <w:szCs w:val="26"/>
+          <w14:ligatures w14:val="none"/>
+        </w:rPr>
+        <w:t xml:space="preserve"> </w:t>
+      </w:r>
+      <w:proofErr w:type="spellStart"/>
+      <w:r>
+        <w:rPr>
+          <w:rFonts w:ascii="Times New Roman" w:hAnsi="Times New Roman" w:cs="Times New Roman"/>
+          <w:kern w:val="0"/>
+          <w:sz w:val="26"/>
+          <w:szCs w:val="26"/>
+          <w14:ligatures w14:val="none"/>
+        </w:rPr>
+        <w:t>là</w:t>
+      </w:r>
+      <w:proofErr w:type="spellEnd"/>
+      <w:r>
+        <w:rPr>
+          <w:rFonts w:ascii="Times New Roman" w:hAnsi="Times New Roman" w:cs="Times New Roman"/>
+          <w:kern w:val="0"/>
+          <w:sz w:val="26"/>
+          <w:szCs w:val="26"/>
+          <w14:ligatures w14:val="none"/>
+        </w:rPr>
+        <w:t xml:space="preserve"> </w:t>
+      </w:r>
+      <w:proofErr w:type="spellStart"/>
+      <w:r>
+        <w:rPr>
+          <w:rFonts w:ascii="Times New Roman" w:hAnsi="Times New Roman" w:cs="Times New Roman"/>
+          <w:kern w:val="0"/>
+          <w:sz w:val="26"/>
+          <w:szCs w:val="26"/>
+          <w14:ligatures w14:val="none"/>
+        </w:rPr>
+        <w:t>hiển</w:t>
+      </w:r>
+      <w:proofErr w:type="spellEnd"/>
+      <w:r>
+        <w:rPr>
+          <w:rFonts w:ascii="Times New Roman" w:hAnsi="Times New Roman" w:cs="Times New Roman"/>
+          <w:kern w:val="0"/>
+          <w:sz w:val="26"/>
+          <w:szCs w:val="26"/>
+          <w14:ligatures w14:val="none"/>
+        </w:rPr>
+        <w:t xml:space="preserve"> </w:t>
+      </w:r>
+      <w:proofErr w:type="spellStart"/>
+      <w:r>
+        <w:rPr>
+          <w:rFonts w:ascii="Times New Roman" w:hAnsi="Times New Roman" w:cs="Times New Roman"/>
+          <w:kern w:val="0"/>
+          <w:sz w:val="26"/>
+          <w:szCs w:val="26"/>
+          <w14:ligatures w14:val="none"/>
+        </w:rPr>
+        <w:t>thị</w:t>
+      </w:r>
+      <w:proofErr w:type="spellEnd"/>
+      <w:r>
+        <w:rPr>
+          <w:rFonts w:ascii="Times New Roman" w:hAnsi="Times New Roman" w:cs="Times New Roman"/>
+          <w:kern w:val="0"/>
+          <w:sz w:val="26"/>
+          <w:szCs w:val="26"/>
+          <w14:ligatures w14:val="none"/>
+        </w:rPr>
+        <w:t xml:space="preserve"> </w:t>
+      </w:r>
+      <w:proofErr w:type="spellStart"/>
+      <w:r>
+        <w:rPr>
+          <w:rFonts w:ascii="Times New Roman" w:hAnsi="Times New Roman" w:cs="Times New Roman"/>
+          <w:kern w:val="0"/>
+          <w:sz w:val="26"/>
+          <w:szCs w:val="26"/>
+          <w14:ligatures w14:val="none"/>
+        </w:rPr>
+        <w:t>sự</w:t>
+      </w:r>
+      <w:proofErr w:type="spellEnd"/>
+      <w:r>
+        <w:rPr>
+          <w:rFonts w:ascii="Times New Roman" w:hAnsi="Times New Roman" w:cs="Times New Roman"/>
+          <w:kern w:val="0"/>
+          <w:sz w:val="26"/>
+          <w:szCs w:val="26"/>
+          <w14:ligatures w14:val="none"/>
+        </w:rPr>
+        <w:t xml:space="preserve"> </w:t>
+      </w:r>
+      <w:proofErr w:type="spellStart"/>
+      <w:r>
+        <w:rPr>
+          <w:rFonts w:ascii="Times New Roman" w:hAnsi="Times New Roman" w:cs="Times New Roman"/>
+          <w:kern w:val="0"/>
+          <w:sz w:val="26"/>
+          <w:szCs w:val="26"/>
+          <w14:ligatures w14:val="none"/>
+        </w:rPr>
+        <w:t>khác</w:t>
+      </w:r>
+      <w:proofErr w:type="spellEnd"/>
+      <w:r>
+        <w:rPr>
+          <w:rFonts w:ascii="Times New Roman" w:hAnsi="Times New Roman" w:cs="Times New Roman"/>
+          <w:kern w:val="0"/>
+          <w:sz w:val="26"/>
+          <w:szCs w:val="26"/>
+          <w14:ligatures w14:val="none"/>
+        </w:rPr>
+        <w:t xml:space="preserve"> </w:t>
+      </w:r>
+      <w:proofErr w:type="spellStart"/>
+      <w:r>
+        <w:rPr>
+          <w:rFonts w:ascii="Times New Roman" w:hAnsi="Times New Roman" w:cs="Times New Roman"/>
+          <w:kern w:val="0"/>
+          <w:sz w:val="26"/>
+          <w:szCs w:val="26"/>
+          <w14:ligatures w14:val="none"/>
+        </w:rPr>
+        <w:t>biệt</w:t>
+      </w:r>
+      <w:proofErr w:type="spellEnd"/>
+      <w:r>
+        <w:rPr>
+          <w:rFonts w:ascii="Times New Roman" w:hAnsi="Times New Roman" w:cs="Times New Roman"/>
+          <w:kern w:val="0"/>
+          <w:sz w:val="26"/>
+          <w:szCs w:val="26"/>
+          <w14:ligatures w14:val="none"/>
+        </w:rPr>
+        <w:t xml:space="preserve"> (</w:t>
+      </w:r>
+      <w:proofErr w:type="spellStart"/>
+      <w:r>
+        <w:rPr>
+          <w:rFonts w:ascii="Times New Roman" w:hAnsi="Times New Roman" w:cs="Times New Roman"/>
+          <w:kern w:val="0"/>
+          <w:sz w:val="26"/>
+          <w:szCs w:val="26"/>
+          <w14:ligatures w14:val="none"/>
+        </w:rPr>
+        <w:t>thay</w:t>
+      </w:r>
+      <w:proofErr w:type="spellEnd"/>
+      <w:r>
+        <w:rPr>
+          <w:rFonts w:ascii="Times New Roman" w:hAnsi="Times New Roman" w:cs="Times New Roman"/>
+          <w:kern w:val="0"/>
+          <w:sz w:val="26"/>
+          <w:szCs w:val="26"/>
+          <w14:ligatures w14:val="none"/>
+        </w:rPr>
+        <w:t xml:space="preserve"> </w:t>
+      </w:r>
+      <w:proofErr w:type="spellStart"/>
+      <w:r>
+        <w:rPr>
+          <w:rFonts w:ascii="Times New Roman" w:hAnsi="Times New Roman" w:cs="Times New Roman"/>
+          <w:kern w:val="0"/>
+          <w:sz w:val="26"/>
+          <w:szCs w:val="26"/>
+          <w14:ligatures w14:val="none"/>
+        </w:rPr>
+        <w:t>đổi</w:t>
+      </w:r>
+      <w:proofErr w:type="spellEnd"/>
+      <w:r>
+        <w:rPr>
+          <w:rFonts w:ascii="Times New Roman" w:hAnsi="Times New Roman" w:cs="Times New Roman"/>
+          <w:kern w:val="0"/>
+          <w:sz w:val="26"/>
+          <w:szCs w:val="26"/>
+          <w14:ligatures w14:val="none"/>
+        </w:rPr>
+        <w:t xml:space="preserve">) </w:t>
+      </w:r>
+      <w:proofErr w:type="spellStart"/>
+      <w:r>
+        <w:rPr>
+          <w:rFonts w:ascii="Times New Roman" w:hAnsi="Times New Roman" w:cs="Times New Roman"/>
+          <w:kern w:val="0"/>
+          <w:sz w:val="26"/>
+          <w:szCs w:val="26"/>
+          <w14:ligatures w14:val="none"/>
+        </w:rPr>
+        <w:t>giữa</w:t>
+      </w:r>
+      <w:proofErr w:type="spellEnd"/>
+      <w:r>
+        <w:rPr>
+          <w:rFonts w:ascii="Times New Roman" w:hAnsi="Times New Roman" w:cs="Times New Roman"/>
+          <w:kern w:val="0"/>
+          <w:sz w:val="26"/>
+          <w:szCs w:val="26"/>
+          <w14:ligatures w14:val="none"/>
+        </w:rPr>
+        <w:t xml:space="preserve"> </w:t>
+      </w:r>
+      <w:proofErr w:type="spellStart"/>
+      <w:r>
+        <w:rPr>
+          <w:rFonts w:ascii="Times New Roman" w:hAnsi="Times New Roman" w:cs="Times New Roman"/>
+          <w:kern w:val="0"/>
+          <w:sz w:val="26"/>
+          <w:szCs w:val="26"/>
+          <w14:ligatures w14:val="none"/>
+        </w:rPr>
+        <w:t>các</w:t>
+      </w:r>
+      <w:proofErr w:type="spellEnd"/>
+      <w:r>
+        <w:rPr>
+          <w:rFonts w:ascii="Times New Roman" w:hAnsi="Times New Roman" w:cs="Times New Roman"/>
+          <w:kern w:val="0"/>
+          <w:sz w:val="26"/>
+          <w:szCs w:val="26"/>
+          <w14:ligatures w14:val="none"/>
+        </w:rPr>
+        <w:t xml:space="preserve"> </w:t>
+      </w:r>
+      <w:proofErr w:type="spellStart"/>
+      <w:r>
+        <w:rPr>
+          <w:rFonts w:ascii="Times New Roman" w:hAnsi="Times New Roman" w:cs="Times New Roman"/>
+          <w:kern w:val="0"/>
+          <w:sz w:val="26"/>
+          <w:szCs w:val="26"/>
+          <w14:ligatures w14:val="none"/>
+        </w:rPr>
+        <w:t>trạng</w:t>
+      </w:r>
+      <w:proofErr w:type="spellEnd"/>
+      <w:r>
+        <w:rPr>
+          <w:rFonts w:ascii="Times New Roman" w:hAnsi="Times New Roman" w:cs="Times New Roman"/>
+          <w:kern w:val="0"/>
+          <w:sz w:val="26"/>
+          <w:szCs w:val="26"/>
+          <w14:ligatures w14:val="none"/>
+        </w:rPr>
+        <w:t xml:space="preserve"> </w:t>
+      </w:r>
+      <w:proofErr w:type="spellStart"/>
+      <w:r>
+        <w:rPr>
+          <w:rFonts w:ascii="Times New Roman" w:hAnsi="Times New Roman" w:cs="Times New Roman"/>
+          <w:kern w:val="0"/>
+          <w:sz w:val="26"/>
+          <w:szCs w:val="26"/>
+          <w14:ligatures w14:val="none"/>
+        </w:rPr>
+        <w:t>thái</w:t>
+      </w:r>
+      <w:proofErr w:type="spellEnd"/>
+      <w:r>
+        <w:rPr>
+          <w:rFonts w:ascii="Times New Roman" w:hAnsi="Times New Roman" w:cs="Times New Roman"/>
+          <w:kern w:val="0"/>
+          <w:sz w:val="26"/>
+          <w:szCs w:val="26"/>
+          <w14:ligatures w14:val="none"/>
+        </w:rPr>
+        <w:t xml:space="preserve"> </w:t>
+      </w:r>
+      <w:proofErr w:type="spellStart"/>
+      <w:r>
+        <w:rPr>
+          <w:rFonts w:ascii="Times New Roman" w:hAnsi="Times New Roman" w:cs="Times New Roman"/>
+          <w:kern w:val="0"/>
+          <w:sz w:val="26"/>
+          <w:szCs w:val="26"/>
+          <w14:ligatures w14:val="none"/>
+        </w:rPr>
+        <w:t>khác</w:t>
+      </w:r>
+      <w:proofErr w:type="spellEnd"/>
+      <w:r>
+        <w:rPr>
+          <w:rFonts w:ascii="Times New Roman" w:hAnsi="Times New Roman" w:cs="Times New Roman"/>
+          <w:kern w:val="0"/>
+          <w:sz w:val="26"/>
+          <w:szCs w:val="26"/>
+          <w14:ligatures w14:val="none"/>
+        </w:rPr>
+        <w:t xml:space="preserve"> </w:t>
+      </w:r>
+      <w:proofErr w:type="spellStart"/>
+      <w:r>
+        <w:rPr>
+          <w:rFonts w:ascii="Times New Roman" w:hAnsi="Times New Roman" w:cs="Times New Roman"/>
+          <w:kern w:val="0"/>
+          <w:sz w:val="26"/>
+          <w:szCs w:val="26"/>
+          <w14:ligatures w14:val="none"/>
+        </w:rPr>
+        <w:t>nhau</w:t>
+      </w:r>
+      <w:proofErr w:type="spellEnd"/>
+      <w:r>
+        <w:rPr>
+          <w:rFonts w:ascii="Times New Roman" w:hAnsi="Times New Roman" w:cs="Times New Roman"/>
+          <w:kern w:val="0"/>
+          <w:sz w:val="26"/>
+          <w:szCs w:val="26"/>
+          <w14:ligatures w14:val="none"/>
+        </w:rPr>
+        <w:t xml:space="preserve"> </w:t>
+      </w:r>
+      <w:proofErr w:type="spellStart"/>
+      <w:r>
+        <w:rPr>
+          <w:rFonts w:ascii="Times New Roman" w:hAnsi="Times New Roman" w:cs="Times New Roman"/>
+          <w:kern w:val="0"/>
+          <w:sz w:val="26"/>
+          <w:szCs w:val="26"/>
+          <w14:ligatures w14:val="none"/>
+        </w:rPr>
+        <w:t>trong</w:t>
+      </w:r>
+      <w:proofErr w:type="spellEnd"/>
+      <w:r>
+        <w:rPr>
+          <w:rFonts w:ascii="Times New Roman" w:hAnsi="Times New Roman" w:cs="Times New Roman"/>
+          <w:kern w:val="0"/>
+          <w:sz w:val="26"/>
+          <w:szCs w:val="26"/>
+          <w14:ligatures w14:val="none"/>
+        </w:rPr>
+        <w:t xml:space="preserve"> </w:t>
+      </w:r>
+      <w:proofErr w:type="spellStart"/>
+      <w:r>
+        <w:rPr>
+          <w:rFonts w:ascii="Times New Roman" w:hAnsi="Times New Roman" w:cs="Times New Roman"/>
+          <w:kern w:val="0"/>
+          <w:sz w:val="26"/>
+          <w:szCs w:val="26"/>
+          <w14:ligatures w14:val="none"/>
+        </w:rPr>
+        <w:t>kho</w:t>
+      </w:r>
+      <w:proofErr w:type="spellEnd"/>
+      <w:r>
+        <w:rPr>
+          <w:rFonts w:ascii="Times New Roman" w:hAnsi="Times New Roman" w:cs="Times New Roman"/>
+          <w:kern w:val="0"/>
+          <w:sz w:val="26"/>
+          <w:szCs w:val="26"/>
+          <w14:ligatures w14:val="none"/>
+        </w:rPr>
+        <w:t xml:space="preserve"> </w:t>
+      </w:r>
+      <w:proofErr w:type="spellStart"/>
+      <w:r>
+        <w:rPr>
+          <w:rFonts w:ascii="Times New Roman" w:hAnsi="Times New Roman" w:cs="Times New Roman"/>
+          <w:kern w:val="0"/>
+          <w:sz w:val="26"/>
+          <w:szCs w:val="26"/>
+          <w14:ligatures w14:val="none"/>
+        </w:rPr>
+        <w:t>lưu</w:t>
+      </w:r>
+      <w:proofErr w:type="spellEnd"/>
+      <w:r>
+        <w:rPr>
+          <w:rFonts w:ascii="Times New Roman" w:hAnsi="Times New Roman" w:cs="Times New Roman"/>
+          <w:kern w:val="0"/>
+          <w:sz w:val="26"/>
+          <w:szCs w:val="26"/>
+          <w14:ligatures w14:val="none"/>
+        </w:rPr>
+        <w:t xml:space="preserve"> </w:t>
+      </w:r>
+      <w:proofErr w:type="spellStart"/>
+      <w:r>
+        <w:rPr>
+          <w:rFonts w:ascii="Times New Roman" w:hAnsi="Times New Roman" w:cs="Times New Roman"/>
+          <w:kern w:val="0"/>
+          <w:sz w:val="26"/>
+          <w:szCs w:val="26"/>
+          <w14:ligatures w14:val="none"/>
+        </w:rPr>
+        <w:t>trữ</w:t>
+      </w:r>
+      <w:proofErr w:type="spellEnd"/>
+      <w:r>
+        <w:rPr>
+          <w:rFonts w:ascii="Times New Roman" w:hAnsi="Times New Roman" w:cs="Times New Roman"/>
+          <w:kern w:val="0"/>
+          <w:sz w:val="26"/>
+          <w:szCs w:val="26"/>
+          <w14:ligatures w14:val="none"/>
+        </w:rPr>
+        <w:t xml:space="preserve"> (repository) </w:t>
+      </w:r>
+      <w:proofErr w:type="spellStart"/>
+      <w:r>
+        <w:rPr>
+          <w:rFonts w:ascii="Times New Roman" w:hAnsi="Times New Roman" w:cs="Times New Roman"/>
+          <w:kern w:val="0"/>
+          <w:sz w:val="26"/>
+          <w:szCs w:val="26"/>
+          <w14:ligatures w14:val="none"/>
+        </w:rPr>
+        <w:t>của</w:t>
+      </w:r>
+      <w:proofErr w:type="spellEnd"/>
+      <w:r>
+        <w:rPr>
+          <w:rFonts w:ascii="Times New Roman" w:hAnsi="Times New Roman" w:cs="Times New Roman"/>
+          <w:kern w:val="0"/>
+          <w:sz w:val="26"/>
+          <w:szCs w:val="26"/>
+          <w14:ligatures w14:val="none"/>
+        </w:rPr>
+        <w:t xml:space="preserve"> </w:t>
+      </w:r>
+      <w:proofErr w:type="spellStart"/>
+      <w:r>
+        <w:rPr>
+          <w:rFonts w:ascii="Times New Roman" w:hAnsi="Times New Roman" w:cs="Times New Roman"/>
+          <w:kern w:val="0"/>
+          <w:sz w:val="26"/>
+          <w:szCs w:val="26"/>
+          <w14:ligatures w14:val="none"/>
+        </w:rPr>
+        <w:t>bạn</w:t>
+      </w:r>
+      <w:proofErr w:type="spellEnd"/>
+    </w:p>
+    <w:p>
+      <w:pPr>
+        <w:rPr>
+          <w:rFonts w:ascii="Times New Roman" w:hAnsi="Times New Roman" w:cs="Times New Roman"/>
+          <w:sz w:val="26"/>
+          <w:szCs w:val="26"/>
+        </w:rPr>
+      </w:pPr>
+      <w:proofErr w:type="spellStart"/>
+      <w:r>
+        <w:rPr>
+          <w:rFonts w:ascii="Times New Roman" w:hAnsi="Times New Roman" w:cs="Times New Roman"/>
+          <w:sz w:val="26"/>
+          <w:szCs w:val="26"/>
+        </w:rPr>
+        <w:t>Ví</w:t>
+      </w:r>
+      <w:proofErr w:type="spellEnd"/>
+      <w:r>
+        <w:rPr>
+          <w:rFonts w:ascii="Times New Roman" w:hAnsi="Times New Roman" w:cs="Times New Roman"/>
+          <w:sz w:val="26"/>
+          <w:szCs w:val="26"/>
+        </w:rPr>
+        <w:t xml:space="preserve"> </w:t>
+      </w:r>
+      <w:proofErr w:type="spellStart"/>
+      <w:r>
+        <w:rPr>
+          <w:rFonts w:ascii="Times New Roman" w:hAnsi="Times New Roman" w:cs="Times New Roman"/>
+          <w:sz w:val="26"/>
+          <w:szCs w:val="26"/>
+        </w:rPr>
+        <w:t>dụ</w:t>
+      </w:r>
+      <w:proofErr w:type="spellEnd"/>
+      <w:r>
+        <w:rPr>
+          <w:rFonts w:ascii="Times New Roman" w:hAnsi="Times New Roman" w:cs="Times New Roman"/>
+          <w:sz w:val="26"/>
+          <w:szCs w:val="26"/>
+        </w:rPr>
+        <w:t xml:space="preserve">: </w:t>
+      </w:r>
+      <w:r>
+        <w:rPr>
+          <w:rFonts w:ascii="Times New Roman" w:hAnsi="Times New Roman" w:cs="Times New Roman"/>
+          <w:sz w:val="26"/>
+          <w:szCs w:val="26"/>
+        </w:rPr>
+        <w:t xml:space="preserve"> </w:t>
+      </w:r>
+      <w:proofErr w:type="spellStart"/>
+      <w:r>
+        <w:rPr>
+          <w:rFonts w:ascii="Times New Roman" w:hAnsi="Times New Roman" w:cs="Times New Roman"/>
+          <w:b/>
+          <w:bCs/>
+          <w:sz w:val="26"/>
+          <w:szCs w:val="26"/>
+        </w:rPr>
+        <w:t>Sửa</w:t>
+      </w:r>
+      <w:proofErr w:type="spellEnd"/>
+      <w:r>
+        <w:rPr>
+          <w:rFonts w:ascii="Times New Roman" w:hAnsi="Times New Roman" w:cs="Times New Roman"/>
+          <w:b/>
+          <w:bCs/>
+          <w:sz w:val="26"/>
+          <w:szCs w:val="26"/>
+        </w:rPr>
+        <w:t xml:space="preserve"> </w:t>
+      </w:r>
+      <w:proofErr w:type="spellStart"/>
+      <w:r>
+        <w:rPr>
+          <w:rFonts w:ascii="Times New Roman" w:hAnsi="Times New Roman" w:cs="Times New Roman"/>
+          <w:b/>
+          <w:bCs/>
+          <w:sz w:val="26"/>
+          <w:szCs w:val="26"/>
+        </w:rPr>
+        <w:t>nội</w:t>
+      </w:r>
+      <w:proofErr w:type="spellEnd"/>
+      <w:r>
+        <w:rPr>
+          <w:rFonts w:ascii="Times New Roman" w:hAnsi="Times New Roman" w:cs="Times New Roman"/>
+          <w:b/>
+          <w:bCs/>
+          <w:sz w:val="26"/>
+          <w:szCs w:val="26"/>
+        </w:rPr>
+        <w:t xml:space="preserve"> dung file </w:t>
+      </w:r>
+      <w:proofErr w:type="spellStart"/>
+      <w:r>
+        <w:rPr>
+          <w:rFonts w:ascii="Times New Roman" w:hAnsi="Times New Roman" w:cs="Times New Roman"/>
+          <w:b/>
+          <w:bCs/>
+          <w:sz w:val="26"/>
+          <w:szCs w:val="26"/>
+        </w:rPr>
+        <w:t>nhưng</w:t>
+      </w:r>
+      <w:proofErr w:type="spellEnd"/>
+      <w:r>
+        <w:rPr>
+          <w:rFonts w:ascii="Times New Roman" w:hAnsi="Times New Roman" w:cs="Times New Roman"/>
+          <w:b/>
+          <w:bCs/>
+          <w:sz w:val="26"/>
+          <w:szCs w:val="26"/>
+        </w:rPr>
+        <w:t xml:space="preserve"> </w:t>
+      </w:r>
+      <w:proofErr w:type="spellStart"/>
+      <w:r>
+        <w:rPr>
+          <w:rFonts w:ascii="Times New Roman" w:hAnsi="Times New Roman" w:cs="Times New Roman"/>
+          <w:b/>
+          <w:bCs/>
+          <w:sz w:val="26"/>
+          <w:szCs w:val="26"/>
+        </w:rPr>
+        <w:t>chưa</w:t>
+      </w:r>
+      <w:proofErr w:type="spellEnd"/>
+      <w:r>
+        <w:rPr>
+          <w:rFonts w:ascii="Times New Roman" w:hAnsi="Times New Roman" w:cs="Times New Roman"/>
+          <w:b/>
+          <w:bCs/>
+          <w:sz w:val="26"/>
+          <w:szCs w:val="26"/>
+        </w:rPr>
+        <w:t xml:space="preserve"> </w:t>
+      </w:r>
+      <w:proofErr w:type="gramStart"/>
+      <w:r>
+        <w:rPr>
+          <w:rFonts w:ascii="Times New Roman" w:hAnsi="Times New Roman" w:cs="Times New Roman"/>
+          <w:b/>
+          <w:bCs/>
+          <w:sz w:val="26"/>
+          <w:szCs w:val="26"/>
+        </w:rPr>
+        <w:t>add</w:t>
+      </w:r>
+      <w:proofErr w:type="gramEnd"/>
+      <w:r>
+        <w:rPr>
+          <w:rFonts w:ascii="Times New Roman" w:hAnsi="Times New Roman" w:cs="Times New Roman"/>
+          <w:sz w:val="26"/>
+          <w:szCs w:val="26"/>
+        </w:rPr>
+        <w:t xml:space="preserve"> </w:t>
+      </w:r>
+    </w:p>
+    <w:p>
+      <w:pPr>
+        <w:rPr>
+          <w:rFonts w:ascii="Times New Roman" w:hAnsi="Times New Roman" w:cs="Times New Roman"/>
+          <w:sz w:val="26"/>
+          <w:szCs w:val="26"/>
+        </w:rPr>
+      </w:pPr>
+      <w:r>
+        <w:rPr>
+          <w:rFonts w:ascii="Times New Roman" w:hAnsi="Times New Roman" w:cs="Times New Roman"/>
+          <w:sz w:val="26"/>
+          <w:szCs w:val="26"/>
+        </w:rPr>
+        <w:drawing>
+          <wp:inline distT="0" distB="0" distL="0" distR="0" wp14:anchorId="057844C3" wp14:editId="41F2183E">
+            <wp:extent cx="5943600" cy="2857500"/>
+            <wp:effectExtent l="0" t="0" r="0" b="0"/>
+            <wp:docPr id="261823374" name="Picture 1" descr="A screenshot of a computer&#10;&#10;Description automatically generated"/>
+            <wp:cNvGraphicFramePr>
+              <a:graphicFrameLocks xmlns:a="http://schemas.openxmlformats.org/drawingml/2006/main" noChangeAspect="1"/>
+            </wp:cNvGraphicFramePr>
+            <a:graphic xmlns:a="http://schemas.openxmlformats.org/drawingml/2006/main">
+              <a:graphicData uri="http://schemas.openxmlformats.org/drawingml/2006/picture">
+                <pic:pic xmlns:pic="http://schemas.openxmlformats.org/drawingml/2006/picture">
+                  <pic:nvPicPr>
+                    <pic:cNvPr id="261823374" name="Picture 1" descr="A screenshot of a computer&#10;&#10;Description automatically generated"/>
+                    <pic:cNvPicPr/>
+                  </pic:nvPicPr>
+                  <pic:blipFill>
+                    <a:blip r:embed="rId4"/>
+                    <a:stretch>
+                      <a:fillRect/>
+                    </a:stretch>
+                  </pic:blipFill>
+                  <pic:spPr>
+                    <a:xfrm>
+                      <a:off x="0" y="0"/>
+                      <a:ext cx="5943600" cy="2857500"/>
+                    </a:xfrm>
+                    <a:prstGeom prst="rect">
+                      <a:avLst/>
+                    </a:prstGeom>
+                  </pic:spPr>
+                </pic:pic>
+              </a:graphicData>
+            </a:graphic>
+          </wp:inline>
+        </w:drawing>
+      </w:r>
+    </w:p>
+    <w:p>
+      <w:pPr>
+        <w:pStyle w:val="ListParagraph"/>
+        <w:rPr>
+          <w:b/>
+          <w:bCs/>
+          <w:sz w:val="24"/>
+          <w:szCs w:val="24"/>
+        </w:rPr>
+      </w:pPr>
+      <w:proofErr w:type="spellStart"/>
+      <w:r>
+        <w:rPr>
+          <w:b/>
+          <w:bCs/>
+          <w:sz w:val="24"/>
+          <w:szCs w:val="24"/>
+        </w:rPr>
+        <w:t>Chạy</w:t>
+      </w:r>
+      <w:proofErr w:type="spellEnd"/>
+      <w:r>
+        <w:rPr>
+          <w:b/>
+          <w:bCs/>
+          <w:sz w:val="24"/>
+          <w:szCs w:val="24"/>
+        </w:rPr>
+        <w:t xml:space="preserve"> </w:t>
+      </w:r>
+      <w:proofErr w:type="spellStart"/>
+      <w:r>
+        <w:rPr>
+          <w:b/>
+          <w:bCs/>
+          <w:sz w:val="24"/>
+          <w:szCs w:val="24"/>
         </w:rPr>
         <w:t>lệnh</w:t>
       </w:r>
       <w:proofErr w:type="spellEnd"/>
       <w:r>
         <w:rPr>
-          <w:rFonts w:ascii="Times New Roman" w:hAnsi="Times New Roman" w:cs="Times New Roman"/>
-          <w:sz w:val="26"/>
-          <w:szCs w:val="26"/>
-        </w:rPr>
-        <w:t xml:space="preserve"> diff </w:t>
-      </w:r>
-      <w:proofErr w:type="spellStart"/>
-      <w:r>
-        <w:rPr>
-          <w:rFonts w:ascii="Times New Roman" w:hAnsi="Times New Roman" w:cs="Times New Roman"/>
-          <w:sz w:val="26"/>
-          <w:szCs w:val="26"/>
-        </w:rPr>
-        <w:t>là</w:t>
-      </w:r>
-      <w:proofErr w:type="spellEnd"/>
-      <w:r>
-        <w:rPr>
-          <w:rFonts w:ascii="Times New Roman" w:hAnsi="Times New Roman" w:cs="Times New Roman"/>
-          <w:sz w:val="26"/>
-          <w:szCs w:val="26"/>
-        </w:rPr>
-        <w:t xml:space="preserve"> dung </w:t>
-      </w:r>
-      <w:proofErr w:type="spellStart"/>
-      <w:r>
-        <w:rPr>
-          <w:rFonts w:ascii="Times New Roman" w:hAnsi="Times New Roman" w:cs="Times New Roman"/>
-          <w:sz w:val="26"/>
-          <w:szCs w:val="26"/>
+          <w:b/>
+          <w:bCs/>
+          <w:sz w:val="24"/>
+          <w:szCs w:val="24"/>
+        </w:rPr>
+        <w:t xml:space="preserve"> git diff </w:t>
+      </w:r>
+      <w:proofErr w:type="spellStart"/>
+      <w:r>
+        <w:rPr>
+          <w:b/>
+          <w:bCs/>
+          <w:sz w:val="24"/>
+          <w:szCs w:val="24"/>
         </w:rPr>
         <w:t>để</w:t>
       </w:r>
       <w:proofErr w:type="spellEnd"/>
       <w:r>
         <w:rPr>
-          <w:rFonts w:ascii="Times New Roman" w:hAnsi="Times New Roman" w:cs="Times New Roman"/>
-          <w:sz w:val="26"/>
-          <w:szCs w:val="26"/>
-        </w:rPr>
-        <w:t xml:space="preserve"> </w:t>
-      </w:r>
-      <w:proofErr w:type="spellStart"/>
-      <w:r>
-        <w:rPr>
-          <w:rFonts w:ascii="Times New Roman" w:hAnsi="Times New Roman" w:cs="Times New Roman"/>
-          <w:sz w:val="26"/>
-          <w:szCs w:val="26"/>
-        </w:rPr>
-        <w:t>xem</w:t>
-      </w:r>
-      <w:proofErr w:type="spellEnd"/>
-      <w:r>
-        <w:rPr>
-          <w:rFonts w:ascii="Times New Roman" w:hAnsi="Times New Roman" w:cs="Times New Roman"/>
-          <w:sz w:val="26"/>
-          <w:szCs w:val="26"/>
-        </w:rPr>
-        <w:t xml:space="preserve"> </w:t>
-      </w:r>
-      <w:proofErr w:type="spellStart"/>
-      <w:r>
-        <w:rPr>
-          <w:rFonts w:ascii="Times New Roman" w:hAnsi="Times New Roman" w:cs="Times New Roman"/>
-          <w:sz w:val="26"/>
-          <w:szCs w:val="26"/>
-        </w:rPr>
-        <w:t>sự</w:t>
-      </w:r>
-      <w:proofErr w:type="spellEnd"/>
-      <w:r>
-        <w:rPr>
-          <w:rFonts w:ascii="Times New Roman" w:hAnsi="Times New Roman" w:cs="Times New Roman"/>
-          <w:sz w:val="26"/>
-          <w:szCs w:val="26"/>
-        </w:rPr>
-        <w:t xml:space="preserve"> </w:t>
-      </w:r>
-      <w:proofErr w:type="spellStart"/>
-      <w:r>
-        <w:rPr>
-          <w:rFonts w:ascii="Times New Roman" w:hAnsi="Times New Roman" w:cs="Times New Roman"/>
-          <w:sz w:val="26"/>
-          <w:szCs w:val="26"/>
-        </w:rPr>
-        <w:t>khác</w:t>
-      </w:r>
-      <w:proofErr w:type="spellEnd"/>
-      <w:r>
-        <w:rPr>
-          <w:rFonts w:ascii="Times New Roman" w:hAnsi="Times New Roman" w:cs="Times New Roman"/>
-          <w:sz w:val="26"/>
-          <w:szCs w:val="26"/>
-        </w:rPr>
-        <w:t xml:space="preserve"> </w:t>
-      </w:r>
-      <w:proofErr w:type="spellStart"/>
-      <w:r>
-        <w:rPr>
-          <w:rFonts w:ascii="Times New Roman" w:hAnsi="Times New Roman" w:cs="Times New Roman"/>
-          <w:sz w:val="26"/>
-          <w:szCs w:val="26"/>
-        </w:rPr>
-        <w:t>biệt</w:t>
-      </w:r>
-      <w:proofErr w:type="spellEnd"/>
-      <w:r>
-        <w:rPr>
-          <w:rFonts w:ascii="Times New Roman" w:hAnsi="Times New Roman" w:cs="Times New Roman"/>
-          <w:sz w:val="26"/>
-          <w:szCs w:val="26"/>
-        </w:rPr>
-        <w:t xml:space="preserve"> </w:t>
-      </w:r>
-      <w:proofErr w:type="spellStart"/>
-      <w:r>
-        <w:rPr>
-          <w:rFonts w:ascii="Times New Roman" w:hAnsi="Times New Roman" w:cs="Times New Roman"/>
-          <w:sz w:val="26"/>
-          <w:szCs w:val="26"/>
-        </w:rPr>
-        <w:t>trước</w:t>
-      </w:r>
-      <w:proofErr w:type="spellEnd"/>
-      <w:r>
-        <w:rPr>
-          <w:rFonts w:ascii="Times New Roman" w:hAnsi="Times New Roman" w:cs="Times New Roman"/>
-          <w:sz w:val="26"/>
-          <w:szCs w:val="26"/>
-        </w:rPr>
-        <w:t xml:space="preserve"> </w:t>
-      </w:r>
-      <w:proofErr w:type="spellStart"/>
-      <w:r>
-        <w:rPr>
-          <w:rFonts w:ascii="Times New Roman" w:hAnsi="Times New Roman" w:cs="Times New Roman"/>
-          <w:sz w:val="26"/>
-          <w:szCs w:val="26"/>
+          <w:b/>
+          <w:bCs/>
+          <w:sz w:val="24"/>
+          <w:szCs w:val="24"/>
+        </w:rPr>
+        <w:t xml:space="preserve"> </w:t>
+      </w:r>
+      <w:proofErr w:type="spellStart"/>
+      <w:r>
+        <w:rPr>
+          <w:b/>
+          <w:bCs/>
+          <w:sz w:val="24"/>
+          <w:szCs w:val="24"/>
+        </w:rPr>
+        <w:t>thấy</w:t>
+      </w:r>
+      <w:proofErr w:type="spellEnd"/>
+      <w:r>
+        <w:rPr>
+          <w:b/>
+          <w:bCs/>
+          <w:sz w:val="24"/>
+          <w:szCs w:val="24"/>
+        </w:rPr>
+        <w:t xml:space="preserve"> </w:t>
+      </w:r>
+      <w:proofErr w:type="spellStart"/>
+      <w:r>
+        <w:rPr>
+          <w:b/>
+          <w:bCs/>
+          <w:sz w:val="24"/>
+          <w:szCs w:val="24"/>
+        </w:rPr>
+        <w:t>những</w:t>
+      </w:r>
+      <w:proofErr w:type="spellEnd"/>
+      <w:r>
+        <w:rPr>
+          <w:b/>
+          <w:bCs/>
+          <w:sz w:val="24"/>
+          <w:szCs w:val="24"/>
+        </w:rPr>
+        <w:t xml:space="preserve"> </w:t>
+      </w:r>
+      <w:proofErr w:type="spellStart"/>
+      <w:r>
+        <w:rPr>
+          <w:b/>
+          <w:bCs/>
+          <w:sz w:val="24"/>
+          <w:szCs w:val="24"/>
+        </w:rPr>
+        <w:t>thay</w:t>
+      </w:r>
+      <w:proofErr w:type="spellEnd"/>
+      <w:r>
+        <w:rPr>
+          <w:b/>
+          <w:bCs/>
+          <w:sz w:val="24"/>
+          <w:szCs w:val="24"/>
+        </w:rPr>
+        <w:t xml:space="preserve"> </w:t>
+      </w:r>
+      <w:proofErr w:type="spellStart"/>
+      <w:r>
+        <w:rPr>
+          <w:b/>
+          <w:bCs/>
+          <w:sz w:val="24"/>
+          <w:szCs w:val="24"/>
+        </w:rPr>
+        <w:t>đổi</w:t>
+      </w:r>
+      <w:proofErr w:type="spellEnd"/>
+      <w:r>
+        <w:rPr>
+          <w:b/>
+          <w:bCs/>
+          <w:sz w:val="24"/>
+          <w:szCs w:val="24"/>
+        </w:rPr>
+        <w:t xml:space="preserve"> </w:t>
+      </w:r>
+      <w:proofErr w:type="spellStart"/>
+      <w:r>
+        <w:rPr>
+          <w:b/>
+          <w:bCs/>
+          <w:sz w:val="24"/>
+          <w:szCs w:val="24"/>
+        </w:rPr>
+        <w:t>nhưng</w:t>
+      </w:r>
+      <w:proofErr w:type="spellEnd"/>
+      <w:r>
+        <w:rPr>
+          <w:b/>
+          <w:bCs/>
+          <w:sz w:val="24"/>
+          <w:szCs w:val="24"/>
+        </w:rPr>
+        <w:t xml:space="preserve"> </w:t>
+      </w:r>
+      <w:proofErr w:type="spellStart"/>
+      <w:r>
+        <w:rPr>
+          <w:b/>
+          <w:bCs/>
+          <w:sz w:val="24"/>
+          <w:szCs w:val="24"/>
+        </w:rPr>
+        <w:t>chưa</w:t>
+      </w:r>
+      <w:proofErr w:type="spellEnd"/>
+      <w:r>
+        <w:rPr>
+          <w:b/>
+          <w:bCs/>
+          <w:sz w:val="24"/>
+          <w:szCs w:val="24"/>
+        </w:rPr>
+        <w:t xml:space="preserve"> </w:t>
+      </w:r>
+      <w:proofErr w:type="gramStart"/>
+      <w:r>
+        <w:rPr>
+          <w:b/>
+          <w:bCs/>
+          <w:sz w:val="24"/>
+          <w:szCs w:val="24"/>
+        </w:rPr>
+        <w:t>add</w:t>
+      </w:r>
+      <w:proofErr w:type="gramEnd"/>
+      <w:r>
+        <w:rPr>
+          <w:b/>
+          <w:bCs/>
+          <w:sz w:val="24"/>
+          <w:szCs w:val="24"/>
+        </w:rPr>
+        <w:t xml:space="preserve"> </w:t>
+      </w:r>
+    </w:p>
+    <w:p>
+      <w:pPr>
+        <w:rPr>
+          <w:rFonts w:ascii="Times New Roman" w:hAnsi="Times New Roman" w:cs="Times New Roman"/>
+          <w:sz w:val="26"/>
+          <w:szCs w:val="26"/>
+        </w:rPr>
+      </w:pPr>
+      <w:r>
+        <w:rPr>
+          <w:rFonts w:ascii="Times New Roman" w:hAnsi="Times New Roman" w:cs="Times New Roman"/>
+          <w:sz w:val="26"/>
+          <w:szCs w:val="26"/>
+        </w:rPr>
+        <w:drawing>
+          <wp:inline distT="0" distB="0" distL="0" distR="0" wp14:anchorId="46DD2E20" wp14:editId="2FCBBF41">
+            <wp:extent cx="2934109" cy="1562318"/>
+            <wp:effectExtent l="0" t="0" r="0" b="0"/>
+            <wp:docPr id="702196505" name="Picture 1" descr="A computer screen with white text&#10;&#10;Description automatically generated"/>
+            <wp:cNvGraphicFramePr>
+              <a:graphicFrameLocks xmlns:a="http://schemas.openxmlformats.org/drawingml/2006/main" noChangeAspect="1"/>
+            </wp:cNvGraphicFramePr>
+            <a:graphic xmlns:a="http://schemas.openxmlformats.org/drawingml/2006/main">
+              <a:graphicData uri="http://schemas.openxmlformats.org/drawingml/2006/picture">
+                <pic:pic xmlns:pic="http://schemas.openxmlformats.org/drawingml/2006/picture">
+                  <pic:nvPicPr>
+                    <pic:cNvPr id="702196505" name="Picture 1" descr="A computer screen with white text&#10;&#10;Description automatically generated"/>
+                    <pic:cNvPicPr/>
+                  </pic:nvPicPr>
+                  <pic:blipFill>
+                    <a:blip r:embed="rId5"/>
+                    <a:stretch>
+                      <a:fillRect/>
+                    </a:stretch>
+                  </pic:blipFill>
+                  <pic:spPr>
+                    <a:xfrm>
+                      <a:off x="0" y="0"/>
+                      <a:ext cx="2934109" cy="1562318"/>
+                    </a:xfrm>
+                    <a:prstGeom prst="rect">
+                      <a:avLst/>
+                    </a:prstGeom>
+                  </pic:spPr>
+                </pic:pic>
+              </a:graphicData>
+            </a:graphic>
+          </wp:inline>
+        </w:drawing>
+      </w:r>
+    </w:p>
+    <w:p>
+      <w:pPr>
+        <w:ind w:firstLine="720"/>
+        <w:rPr>
+          <w:b/>
+          <w:bCs/>
+          <w:kern w:val="0"/>
+          <w:sz w:val="24"/>
+          <w:szCs w:val="24"/>
+          <w14:ligatures w14:val="none"/>
+        </w:rPr>
+      </w:pPr>
+      <w:r>
+        <w:rPr>
+          <w:b/>
+          <w:bCs/>
+          <w:kern w:val="0"/>
+          <w:sz w:val="24"/>
+          <w:szCs w:val="24"/>
+          <w14:ligatures w14:val="none"/>
+        </w:rPr>
+        <w:t xml:space="preserve">Sau </w:t>
+      </w:r>
+      <w:proofErr w:type="spellStart"/>
+      <w:r>
+        <w:rPr>
+          <w:b/>
+          <w:bCs/>
+          <w:kern w:val="0"/>
+          <w:sz w:val="24"/>
+          <w:szCs w:val="24"/>
+          <w14:ligatures w14:val="none"/>
         </w:rPr>
         <w:t>khi</w:t>
       </w:r>
       <w:proofErr w:type="spellEnd"/>
       <w:r>
         <w:rPr>
-          <w:rFonts w:ascii="Times New Roman" w:hAnsi="Times New Roman" w:cs="Times New Roman"/>
-          <w:sz w:val="26"/>
-          <w:szCs w:val="26"/>
-        </w:rPr>
-        <w:t xml:space="preserve"> </w:t>
-      </w:r>
+          <w:b/>
+          <w:bCs/>
+          <w:kern w:val="0"/>
+          <w:sz w:val="24"/>
+          <w:szCs w:val="24"/>
+          <w14:ligatures w14:val="none"/>
+        </w:rPr>
+        <w:t xml:space="preserve"> commit </w:t>
+      </w:r>
+      <w:proofErr w:type="spellStart"/>
+      <w:r>
+        <w:rPr>
+          <w:b/>
+          <w:bCs/>
+          <w:kern w:val="0"/>
+          <w:sz w:val="24"/>
+          <w:szCs w:val="24"/>
+          <w14:ligatures w14:val="none"/>
+        </w:rPr>
+        <w:t>thì</w:t>
+      </w:r>
+      <w:proofErr w:type="spellEnd"/>
+      <w:r>
+        <w:rPr>
+          <w:b/>
+          <w:bCs/>
+          <w:kern w:val="0"/>
+          <w:sz w:val="24"/>
+          <w:szCs w:val="24"/>
+          <w14:ligatures w14:val="none"/>
+        </w:rPr>
+        <w:t xml:space="preserve"> </w:t>
+      </w:r>
+      <w:proofErr w:type="spellStart"/>
+      <w:r>
+        <w:rPr>
+          <w:b/>
+          <w:bCs/>
+          <w:kern w:val="0"/>
+          <w:sz w:val="24"/>
+          <w:szCs w:val="24"/>
+          <w14:ligatures w14:val="none"/>
+        </w:rPr>
+        <w:t>chạy</w:t>
+      </w:r>
+      <w:proofErr w:type="spellEnd"/>
+      <w:r>
+        <w:rPr>
+          <w:b/>
+          <w:bCs/>
+          <w:kern w:val="0"/>
+          <w:sz w:val="24"/>
+          <w:szCs w:val="24"/>
+          <w14:ligatures w14:val="none"/>
+        </w:rPr>
+        <w:t xml:space="preserve"> </w:t>
+      </w:r>
+      <w:proofErr w:type="spellStart"/>
+      <w:r>
+        <w:rPr>
+          <w:b/>
+          <w:bCs/>
+          <w:kern w:val="0"/>
+          <w:sz w:val="24"/>
+          <w:szCs w:val="24"/>
+          <w14:ligatures w14:val="none"/>
+        </w:rPr>
+        <w:t>lệnh</w:t>
+      </w:r>
+      <w:proofErr w:type="spellEnd"/>
+      <w:r>
+        <w:rPr>
+          <w:b/>
+          <w:bCs/>
+          <w:kern w:val="0"/>
+          <w:sz w:val="24"/>
+          <w:szCs w:val="24"/>
+          <w14:ligatures w14:val="none"/>
+        </w:rPr>
+        <w:t xml:space="preserve"> ko </w:t>
+      </w:r>
+      <w:proofErr w:type="spellStart"/>
+      <w:r>
+        <w:rPr>
+          <w:b/>
+          <w:bCs/>
+          <w:kern w:val="0"/>
+          <w:sz w:val="24"/>
+          <w:szCs w:val="24"/>
+          <w14:ligatures w14:val="none"/>
+        </w:rPr>
+        <w:t>hiện</w:t>
+      </w:r>
+      <w:proofErr w:type="spellEnd"/>
+      <w:r>
+        <w:rPr>
+          <w:b/>
+          <w:bCs/>
+          <w:kern w:val="0"/>
+          <w:sz w:val="24"/>
+          <w:szCs w:val="24"/>
+          <w14:ligatures w14:val="none"/>
+        </w:rPr>
+        <w:t xml:space="preserve"> </w:t>
+      </w:r>
+      <w:proofErr w:type="spellStart"/>
+      <w:r>
+        <w:rPr>
+          <w:b/>
+          <w:bCs/>
+          <w:kern w:val="0"/>
+          <w:sz w:val="24"/>
+          <w:szCs w:val="24"/>
+          <w14:ligatures w14:val="none"/>
+        </w:rPr>
+        <w:t>thay</w:t>
+      </w:r>
+      <w:proofErr w:type="spellEnd"/>
+      <w:r>
+        <w:rPr>
+          <w:b/>
+          <w:bCs/>
+          <w:kern w:val="0"/>
+          <w:sz w:val="24"/>
+          <w:szCs w:val="24"/>
+          <w14:ligatures w14:val="none"/>
+        </w:rPr>
+        <w:t xml:space="preserve"> </w:t>
+      </w:r>
+      <w:proofErr w:type="spellStart"/>
       <w:proofErr w:type="gramStart"/>
       <w:r>
         <w:rPr>
-          <w:rFonts w:ascii="Times New Roman" w:hAnsi="Times New Roman" w:cs="Times New Roman"/>
-          <w:sz w:val="26"/>
-          <w:szCs w:val="26"/>
-        </w:rPr>
-        <w:t>commit .</w:t>
-      </w:r>
+          <w:b/>
+          <w:bCs/>
+          <w:kern w:val="0"/>
+          <w:sz w:val="24"/>
+          <w:szCs w:val="24"/>
+          <w14:ligatures w14:val="none"/>
+        </w:rPr>
+        <w:t>đổi</w:t>
+      </w:r>
+      <w:proofErr w:type="spellEnd"/>
       <w:proofErr w:type="gramEnd"/>
-      <w:r>
-        <w:rPr>
-          <w:rFonts w:ascii="Times New Roman" w:hAnsi="Times New Roman" w:cs="Times New Roman"/>
-          <w:sz w:val="26"/>
-          <w:szCs w:val="26"/>
-        </w:rPr>
-        <w:t xml:space="preserve"> </w:t>
-      </w:r>
-      <w:proofErr w:type="spellStart"/>
-      <w:r>
-        <w:rPr>
-          <w:rFonts w:ascii="Times New Roman" w:hAnsi="Times New Roman" w:cs="Times New Roman"/>
-          <w:sz w:val="26"/>
-          <w:szCs w:val="26"/>
-        </w:rPr>
-        <w:t>Tóm</w:t>
-      </w:r>
-      <w:proofErr w:type="spellEnd"/>
-      <w:r>
-        <w:rPr>
-          <w:rFonts w:ascii="Times New Roman" w:hAnsi="Times New Roman" w:cs="Times New Roman"/>
-          <w:sz w:val="26"/>
-          <w:szCs w:val="26"/>
-        </w:rPr>
-        <w:t xml:space="preserve"> </w:t>
-      </w:r>
-      <w:proofErr w:type="spellStart"/>
-      <w:r>
-        <w:rPr>
-          <w:rFonts w:ascii="Times New Roman" w:hAnsi="Times New Roman" w:cs="Times New Roman"/>
-          <w:sz w:val="26"/>
-          <w:szCs w:val="26"/>
-        </w:rPr>
-        <w:t>gọn</w:t>
-      </w:r>
-      <w:proofErr w:type="spellEnd"/>
-      <w:r>
-        <w:rPr>
-          <w:rFonts w:ascii="Times New Roman" w:hAnsi="Times New Roman" w:cs="Times New Roman"/>
-          <w:sz w:val="26"/>
-          <w:szCs w:val="26"/>
-        </w:rPr>
-        <w:t xml:space="preserve"> diff </w:t>
-      </w:r>
-      <w:proofErr w:type="spellStart"/>
-      <w:r>
-        <w:rPr>
-          <w:rFonts w:ascii="Times New Roman" w:hAnsi="Times New Roman" w:cs="Times New Roman"/>
-          <w:sz w:val="26"/>
-          <w:szCs w:val="26"/>
-        </w:rPr>
-        <w:t>nó</w:t>
-      </w:r>
-      <w:proofErr w:type="spellEnd"/>
-      <w:r>
-        <w:rPr>
-          <w:rFonts w:ascii="Times New Roman" w:hAnsi="Times New Roman" w:cs="Times New Roman"/>
-          <w:sz w:val="26"/>
-          <w:szCs w:val="26"/>
-        </w:rPr>
-        <w:t xml:space="preserve"> </w:t>
-      </w:r>
-      <w:proofErr w:type="spellStart"/>
-      <w:r>
-        <w:rPr>
-          <w:rFonts w:ascii="Times New Roman" w:hAnsi="Times New Roman" w:cs="Times New Roman"/>
-          <w:sz w:val="26"/>
-          <w:szCs w:val="26"/>
-        </w:rPr>
-        <w:t>là</w:t>
-      </w:r>
-      <w:proofErr w:type="spellEnd"/>
-      <w:r>
-        <w:rPr>
-          <w:rFonts w:ascii="Times New Roman" w:hAnsi="Times New Roman" w:cs="Times New Roman"/>
-          <w:sz w:val="26"/>
-          <w:szCs w:val="26"/>
-        </w:rPr>
-        <w:t xml:space="preserve"> </w:t>
-      </w:r>
-      <w:proofErr w:type="spellStart"/>
-      <w:r>
-        <w:rPr>
-          <w:rFonts w:ascii="Times New Roman" w:hAnsi="Times New Roman" w:cs="Times New Roman"/>
-          <w:sz w:val="26"/>
-          <w:szCs w:val="26"/>
-        </w:rPr>
-        <w:t>theo</w:t>
-      </w:r>
-      <w:proofErr w:type="spellEnd"/>
-      <w:r>
-        <w:rPr>
-          <w:rFonts w:ascii="Times New Roman" w:hAnsi="Times New Roman" w:cs="Times New Roman"/>
-          <w:sz w:val="26"/>
-          <w:szCs w:val="26"/>
-        </w:rPr>
-        <w:t xml:space="preserve"> </w:t>
-      </w:r>
-      <w:proofErr w:type="spellStart"/>
-      <w:r>
-        <w:rPr>
-          <w:rFonts w:ascii="Times New Roman" w:hAnsi="Times New Roman" w:cs="Times New Roman"/>
-          <w:sz w:val="26"/>
-          <w:szCs w:val="26"/>
-        </w:rPr>
-        <w:t>dõi</w:t>
-      </w:r>
-      <w:proofErr w:type="spellEnd"/>
-      <w:r>
-        <w:rPr>
-          <w:rFonts w:ascii="Times New Roman" w:hAnsi="Times New Roman" w:cs="Times New Roman"/>
-          <w:sz w:val="26"/>
-          <w:szCs w:val="26"/>
-        </w:rPr>
-        <w:t xml:space="preserve"> </w:t>
-      </w:r>
-      <w:proofErr w:type="spellStart"/>
-      <w:r>
-        <w:rPr>
-          <w:rFonts w:ascii="Times New Roman" w:hAnsi="Times New Roman" w:cs="Times New Roman"/>
-          <w:sz w:val="26"/>
-          <w:szCs w:val="26"/>
-        </w:rPr>
-        <w:t>các</w:t>
-      </w:r>
-      <w:proofErr w:type="spellEnd"/>
-      <w:r>
-        <w:rPr>
-          <w:rFonts w:ascii="Times New Roman" w:hAnsi="Times New Roman" w:cs="Times New Roman"/>
-          <w:sz w:val="26"/>
-          <w:szCs w:val="26"/>
-        </w:rPr>
-        <w:t xml:space="preserve"> </w:t>
-      </w:r>
-      <w:proofErr w:type="spellStart"/>
-      <w:r>
-        <w:rPr>
-          <w:rFonts w:ascii="Times New Roman" w:hAnsi="Times New Roman" w:cs="Times New Roman"/>
-          <w:sz w:val="26"/>
-          <w:szCs w:val="26"/>
-        </w:rPr>
-        <w:t>thay</w:t>
-      </w:r>
-      <w:proofErr w:type="spellEnd"/>
-      <w:r>
-        <w:rPr>
-          <w:rFonts w:ascii="Times New Roman" w:hAnsi="Times New Roman" w:cs="Times New Roman"/>
-          <w:sz w:val="26"/>
-          <w:szCs w:val="26"/>
-        </w:rPr>
-        <w:t xml:space="preserve"> </w:t>
-      </w:r>
-      <w:proofErr w:type="spellStart"/>
-      <w:r>
-        <w:rPr>
-          <w:rFonts w:ascii="Times New Roman" w:hAnsi="Times New Roman" w:cs="Times New Roman"/>
-          <w:sz w:val="26"/>
-          <w:szCs w:val="26"/>
-        </w:rPr>
-        <w:t>đổi</w:t>
-      </w:r>
-      <w:proofErr w:type="spellEnd"/>
-      <w:r>
-        <w:rPr>
-          <w:rFonts w:ascii="Times New Roman" w:hAnsi="Times New Roman" w:cs="Times New Roman"/>
-          <w:sz w:val="26"/>
-          <w:szCs w:val="26"/>
-        </w:rPr>
-        <w:t xml:space="preserve"> </w:t>
-      </w:r>
+    </w:p>
+    <w:p>
+      <w:pPr>
+        <w:ind w:firstLine="720"/>
+        <w:rPr>
+          <w:rFonts w:ascii="Times New Roman" w:hAnsi="Times New Roman" w:cs="Times New Roman"/>
+          <w:b/>
+          <w:bCs/>
+          <w:sz w:val="28"/>
+          <w:szCs w:val="28"/>
+        </w:rPr>
+      </w:pPr>
+      <w:r>
+        <w:rPr>
+          <w:rFonts w:ascii="Times New Roman" w:hAnsi="Times New Roman" w:cs="Times New Roman"/>
+          <w:b/>
+          <w:bCs/>
+          <w:sz w:val="28"/>
+          <w:szCs w:val="28"/>
+        </w:rPr>
+        <w:drawing>
+          <wp:inline distT="0" distB="0" distL="0" distR="0" wp14:anchorId="061D8F68" wp14:editId="37132C26">
+            <wp:extent cx="4525006" cy="1047896"/>
+            <wp:effectExtent l="0" t="0" r="9525" b="0"/>
+            <wp:docPr id="571270328" name="Picture 1" descr="A screen shot of a computer program&#10;&#10;Description automatically generated"/>
+            <wp:cNvGraphicFramePr>
+              <a:graphicFrameLocks xmlns:a="http://schemas.openxmlformats.org/drawingml/2006/main" noChangeAspect="1"/>
+            </wp:cNvGraphicFramePr>
+            <a:graphic xmlns:a="http://schemas.openxmlformats.org/drawingml/2006/main">
+              <a:graphicData uri="http://schemas.openxmlformats.org/drawingml/2006/picture">
+                <pic:pic xmlns:pic="http://schemas.openxmlformats.org/drawingml/2006/picture">
+                  <pic:nvPicPr>
+                    <pic:cNvPr id="571270328" name="Picture 1" descr="A screen shot of a computer program&#10;&#10;Description automatically generated"/>
+                    <pic:cNvPicPr/>
+                  </pic:nvPicPr>
+                  <pic:blipFill>
+                    <a:blip r:embed="rId6"/>
+                    <a:stretch>
+                      <a:fillRect/>
+                    </a:stretch>
+                  </pic:blipFill>
+                  <pic:spPr>
+                    <a:xfrm>
+                      <a:off x="0" y="0"/>
+                      <a:ext cx="4525006" cy="1047896"/>
+                    </a:xfrm>
+                    <a:prstGeom prst="rect">
+                      <a:avLst/>
+                    </a:prstGeom>
+                  </pic:spPr>
+                </pic:pic>
+              </a:graphicData>
+            </a:graphic>
+          </wp:inline>
+        </w:drawing>
+      </w:r>
+    </w:p>
+    <w:p>
+      <w:pPr>
+        <w:ind w:firstLine="720"/>
+        <w:rPr>
+          <w:rFonts w:ascii="Times New Roman" w:hAnsi="Times New Roman" w:cs="Times New Roman"/>
+          <w:b/>
+          <w:bCs/>
+          <w:sz w:val="28"/>
+          <w:szCs w:val="28"/>
+        </w:rPr>
+      </w:pPr>
     </w:p>
     <w:sectPr>
       <w:pgSz w:w="12240" w:h="15840"/>
@@ -845,6 +1732,18 @@
     <w:semiHidden/>
     <w:unhideWhenUsed/>
   </w:style>
+  <w:style w:type="paragraph" w:styleId="ListParagraph">
+    <w:name w:val="List Paragraph"/>
+    <w:basedOn w:val="Normal"/>
+    <w:uiPriority w:val="34"/>
+    <w:qFormat/>
+    <w:rsid w:val="00B42018"/>
+    <w:pPr>
+      <w:spacing w:line="256" w:lineRule="auto"/>
+      <w:ind w:left="720"/>
+      <w:contextualSpacing/>
+    </w:pPr>
+  </w:style>
 </w:styles>
 </file>
 

</xml_diff>